<commit_message>
feat: integrate sizing and scoping practice
</commit_message>
<xml_diff>
--- a/STEER-Framework.docx
+++ b/STEER-Framework.docx
@@ -1515,6 +1515,79 @@
     </w:p>
     <w:p>
       <w:pPr>
+        <w:pStyle w:val="Heading1"/>
+        <w:pageBreakBefore/>
+        <w:spacing w:before="340" w:after="60"/>
+      </w:pPr>
+      <w:r>
+        <w:rPr>
+          <w:b/>
+          <w:color w:val="1A1A1A"/>
+          <w:sz w:val="30"/>
+        </w:rPr>
+        <w:t>Sizing and Scoping</w:t>
+      </w:r>
+    </w:p>
+    <w:p>
+      <w:pPr>
+        <w:spacing w:after="160" w:line="274" w:lineRule="auto"/>
+      </w:pPr>
+      <w:r>
+        <w:rPr>
+          <w:color w:val="1A1A1A"/>
+          <w:sz w:val="22"/>
+        </w:rPr>
+      </w:r>
+    </w:p>
+    <w:p>
+      <w:pPr>
+        <w:spacing w:after="160" w:line="274" w:lineRule="auto"/>
+      </w:pPr>
+      <w:r>
+        <w:rPr>
+          <w:color w:val="1A1A1A"/>
+          <w:sz w:val="22"/>
+        </w:rPr>
+        <w:t>STEER sizes ambiguity, not agent effort. At Frame, a brief is right-sized only when it can be expressed as one outcome, one independently authored exam, and one coherent shape. If the exam cannot be written crisply, split the brief before Gate 1. Scope then freezes at Gate 1: a new want must return as a revision through the gate or become a new brief.</w:t>
+      </w:r>
+    </w:p>
+    <w:p>
+      <w:pPr>
+        <w:spacing w:after="160" w:line="274" w:lineRule="auto"/>
+      </w:pPr>
+      <w:r>
+        <w:rPr>
+          <w:color w:val="1A1A1A"/>
+          <w:sz w:val="22"/>
+        </w:rPr>
+        <w:t>Engineer adds a second alarm: a plan that sprawls across roughly twenty files and four systems is a signal to split at a user path, domain tag, interface seam, or legacy on-ramp. Builders implement to the signed exam and cannot expand or edit it.</w:t>
+      </w:r>
+    </w:p>
+    <w:p>
+      <w:pPr>
+        <w:spacing w:after="160" w:line="274" w:lineRule="auto"/>
+      </w:pPr>
+      <w:r>
+        <w:rPr>
+          <w:color w:val="1A1A1A"/>
+          <w:sz w:val="22"/>
+        </w:rPr>
+        <w:t>Forecasting uses cycle-time percentiles by brief shape, normally the 85th percentile, while aging replaces sprint rollover: each Flight Board state has a historical cycle-time band, and a breach escalates to a huddle. Real deadlines enter the brief as constraints, never as estimates. See STEER Practice Note 1, Sizing and Scoping Work in STEER, for the complete operating guidance.</w:t>
+      </w:r>
+    </w:p>
+    <w:p>
+      <w:pPr>
+        <w:spacing w:after="160" w:line="274" w:lineRule="auto"/>
+      </w:pPr>
+      <w:r>
+        <w:rPr>
+          <w:color w:val="1A1A1A"/>
+          <w:sz w:val="22"/>
+        </w:rPr>
+      </w:r>
+    </w:p>
+    <w:p>
+      <w:pPr>
         <w:spacing w:after="90" w:before="240"/>
       </w:pPr>
       <w:r>
@@ -1610,6 +1683,24 @@
           <w:szCs w:val="20"/>
         </w:rPr>
         <w:t xml:space="preserve"> · How: accountabilities, decision rights, trust policy, culture, and scale</w:t>
+      </w:r>
+    </w:p>
+    <w:p>
+      <w:pPr>
+        <w:pStyle w:val="ListParagraph"/>
+        <w:numPr>
+          <w:ilvl w:val="0"/>
+          <w:numId w:val="2"/>
+        </w:numPr>
+        <w:spacing w:after="80" w:line="268"/>
+      </w:pPr>
+      <w:r>
+        <w:rPr>
+          <w:b/>
+          <w:color w:val="1A1A1A"/>
+          <w:sz w:val="20"/>
+        </w:rPr>
+        <w:t>STEER Practice Note 1 · Sizing and Scoping Work in STEER · How: exam-writability, scope alarms, aging bands, and percentile forecasting</w:t>
       </w:r>
     </w:p>
     <w:p>

</xml_diff>

<commit_message>
feat: add interview-first intent practice
</commit_message>
<xml_diff>
--- a/STEER-Framework.docx
+++ b/STEER-Framework.docx
@@ -1577,17 +1577,6 @@
     </w:p>
     <w:p>
       <w:pPr>
-        <w:spacing w:after="160" w:line="274" w:lineRule="auto"/>
-      </w:pPr>
-      <w:r>
-        <w:rPr>
-          <w:color w:val="1A1A1A"/>
-          <w:sz w:val="22"/>
-        </w:rPr>
-      </w:r>
-    </w:p>
-    <w:p>
-      <w:pPr>
         <w:spacing w:after="90" w:before="240"/>
       </w:pPr>
       <w:r>
@@ -1701,6 +1690,24 @@
           <w:sz w:val="20"/>
         </w:rPr>
         <w:t>STEER Practice Note 1 · Sizing and Scoping Work in STEER · How: exam-writability, scope alarms, aging bands, and percentile forecasting</w:t>
+      </w:r>
+    </w:p>
+    <w:p>
+      <w:pPr>
+        <w:pStyle w:val="ListParagraph"/>
+        <w:numPr>
+          <w:ilvl w:val="0"/>
+          <w:numId w:val="2"/>
+        </w:numPr>
+        <w:spacing w:after="80" w:line="268"/>
+      </w:pPr>
+      <w:r>
+        <w:rPr>
+          <w:b/>
+          <w:color w:val="1A1A1A"/>
+          <w:sz w:val="20"/>
+        </w:rPr>
+        <w:t>STEER Practice Note 2 · Providing Intent · How: interviews, rendered drafts, open questions, and meaning-first approval</w:t>
       </w:r>
     </w:p>
     <w:p>

</xml_diff>

<commit_message>
feat: add three-surface role home
</commit_message>
<xml_diff>
--- a/STEER-Framework.docx
+++ b/STEER-Framework.docx
@@ -352,6 +352,48 @@
           <w:sz w:val="30"/>
           <w:szCs w:val="30"/>
         </w:rPr>
+        <w:t xml:space="preserve">The Three Surfaces</w:t>
+      </w:r>
+    </w:p>
+    <w:p>
+      <w:pPr>
+        <w:spacing w:after="160" w:line="274"/>
+      </w:pPr>
+      <w:r>
+        <w:rPr>
+          <w:color w:val="1a1a1a"/>
+          <w:sz w:val="22"/>
+          <w:szCs w:val="22"/>
+        </w:rPr>
+        <w:t xml:space="preserve">An intent is a candidate brief in the intent backlog. It becomes a work item only when the Product Lead pulls it into flight against the pod's visible WIP limit. This boundary absorbs machine-speed supply without allowing it to flood human-speed judgment.</w:t>
+      </w:r>
+    </w:p>
+    <w:p>
+      <w:pPr>
+        <w:spacing w:after="160" w:line="274"/>
+      </w:pPr>
+      <w:r>
+        <w:rPr>
+          <w:color w:val="1a1a1a"/>
+          <w:sz w:val="22"/>
+          <w:szCs w:val="22"/>
+        </w:rPr>
+        <w:t xml:space="preserve">Every role home preserves the same attention order: the decision inbox for what needs judgment now, triggered candidates for what could enter next, and an ambient in-motion pane watched by aging bands. The platform projects these surfaces from the chain; it stores no private status. See STEER Practice Note 3, The Three Surfaces.</w:t>
+      </w:r>
+    </w:p>
+    <w:p>
+      <w:pPr>
+        <w:pStyle w:val="Heading1"/>
+        <w:spacing w:after="60" w:before="340"/>
+      </w:pPr>
+      <w:r>
+        <w:rPr>
+          <w:b/>
+          <w:bCs/>
+          <w:color w:val="1a1a1a"/>
+          <w:sz w:val="30"/>
+          <w:szCs w:val="30"/>
+        </w:rPr>
         <w:t xml:space="preserve">The Eight Plays</w:t>
       </w:r>
     </w:p>
@@ -1708,6 +1750,24 @@
           <w:sz w:val="20"/>
         </w:rPr>
         <w:t>STEER Practice Note 2 · Providing Intent · How: interviews, rendered drafts, open questions, and meaning-first approval</w:t>
+      </w:r>
+    </w:p>
+    <w:p>
+      <w:pPr>
+        <w:pStyle w:val="ListParagraph"/>
+        <w:numPr>
+          <w:ilvl w:val="0"/>
+          <w:numId w:val="2"/>
+        </w:numPr>
+        <w:spacing w:after="80" w:line="268"/>
+      </w:pPr>
+      <w:r>
+        <w:rPr>
+          <w:b/>
+          <w:color w:val="1A1A1A"/>
+          <w:sz w:val="20"/>
+        </w:rPr>
+        <w:t>STEER Practice Note 3 · The Three Surfaces · How: intent backlog, pull boundary, role home, and protected attention</w:t>
       </w:r>
     </w:p>
     <w:p>

</xml_diff>

<commit_message>
docs: align STEER canon to v3.1
</commit_message>
<xml_diff>
--- a/STEER-Framework.docx
+++ b/STEER-Framework.docx
@@ -71,7 +71,7 @@
           <w:sz w:val="21"/>
           <w:szCs w:val="21"/>
         </w:rPr>
-        <w:t xml:space="preserve">Idriss Enayat</w:t>
+        <w:t>Idriss Enayat</w:t>
       </w:r>
       <w:r>
         <w:rPr>
@@ -79,7 +79,7 @@
           <w:sz w:val="20"/>
           <w:szCs w:val="20"/>
         </w:rPr>
-        <w:t xml:space="preserve">   ·   Framework v3.0   ·   August 2026</w:t>
+        <w:t xml:space="preserve">   ·   Framework v3.1   ·   September 2026</w:t>
       </w:r>
     </w:p>
     <w:p>
@@ -92,7 +92,7 @@
           <w:sz w:val="22"/>
           <w:szCs w:val="22"/>
         </w:rPr>
-        <w:t xml:space="preserve">This document defines STEER's structure: the layers, the artifact chain that forms the lifecycle's backbone, the eight plays, the three gates, and the measurement system. The Methodology document states why; the Operating Model document defines who decides and how organizations run it.</w:t>
+        <w:t>This document defines STEER's structure: the organization topology, the layers, the artifact chain that forms the lifecycle's backbone, the eight plays, the three gates, and the measurement system. The Methodology document states why; the Operating Model document defines who decides and how organizations run it.</w:t>
       </w:r>
     </w:p>
     <w:p>
@@ -214,6 +214,76 @@
           <w:sz w:val="30"/>
           <w:szCs w:val="30"/>
         </w:rPr>
+        <w:t>Organization Structure</w:t>
+      </w:r>
+    </w:p>
+    <w:p>
+      <w:pPr>
+        <w:pBdr>
+          <w:bottom w:val="single" w:color="2f4bd0" w:sz="8" w:space="4"/>
+        </w:pBdr>
+        <w:spacing w:after="200"/>
+      </w:pPr>
+      <w:r>
+        <w:rPr>
+          <w:sz w:val="2"/>
+          <w:szCs w:val="2"/>
+        </w:rPr>
+      </w:r>
+    </w:p>
+    <w:p>
+      <w:pPr>
+        <w:spacing w:after="160" w:line="274"/>
+      </w:pPr>
+      <w:r>
+        <w:rPr>
+          <w:color w:val="1a1a1a"/>
+          <w:sz w:val="22"/>
+          <w:szCs w:val="22"/>
+        </w:rPr>
+        <w:t>STEER projects a versioned organization → portfolio → product → pod topology, with an organization-level specialist pool. The operating repository declares governance and inheritance; each product names one home repository for item chains. Org Admins manage tenant identities, agents, keys, budgets, and defaults; Portfolio Leads sign mission briefs; Product Stewards exist when multiple pods share a product; the four pod accountabilities run the loop.</w:t>
+      </w:r>
+    </w:p>
+    <w:p>
+      <w:pPr>
+        <w:spacing w:after="160" w:line="274"/>
+      </w:pPr>
+      <w:r>
+        <w:rPr>
+          <w:color w:val="1a1a1a"/>
+          <w:sz w:val="22"/>
+          <w:szCs w:val="22"/>
+        </w:rPr>
+        <w:t>People and agents are identities assigned to explicit hats. One person may hold every hat. Capacity rolls up per human across pods and hats, while tenant boundaries isolate memory, keys, sandboxes, and evidence. Stack Packs make product stack choices operational, and readiness scans turn brownfield gaps into on-ramp briefs.</w:t>
+      </w:r>
+    </w:p>
+    <w:p>
+      <w:pPr>
+        <w:pBdr>
+          <w:bottom w:val="single" w:color="2f4bd0" w:sz="8" w:space="4"/>
+        </w:pBdr>
+        <w:spacing w:after="200"/>
+      </w:pPr>
+      <w:r>
+        <w:rPr>
+          <w:sz w:val="2"/>
+          <w:szCs w:val="2"/>
+        </w:rPr>
+      </w:r>
+    </w:p>
+    <w:p>
+      <w:pPr>
+        <w:pStyle w:val="Heading1"/>
+        <w:spacing w:after="60" w:before="340"/>
+      </w:pPr>
+      <w:r>
+        <w:rPr>
+          <w:b/>
+          <w:bCs/>
+          <w:color w:val="1a1a1a"/>
+          <w:sz w:val="30"/>
+          <w:szCs w:val="30"/>
+        </w:rPr>
         <w:t xml:space="preserve">The Artifact Chain</w:t>
       </w:r>
     </w:p>
@@ -365,7 +435,7 @@
           <w:sz w:val="22"/>
           <w:szCs w:val="22"/>
         </w:rPr>
-        <w:t xml:space="preserve">An intent is a candidate brief in the intent backlog. It becomes a work item only when the Product Lead pulls it into flight against the pod's visible WIP limit. This boundary absorbs machine-speed supply without allowing it to flood human-speed judgment.</w:t>
+        <w:t>An intent is a candidate brief in the intent backlog. It becomes a work item only when the Product Lead pulls it into flight against the visible WIP limit for the responsible human across every pod and hat they hold. This boundary absorbs machine-speed supply without allowing it to flood human-speed judgment.</w:t>
       </w:r>
     </w:p>
     <w:p>
@@ -618,7 +688,7 @@
                 <w:sz w:val="19"/>
                 <w:szCs w:val="19"/>
               </w:rPr>
-              <w:t xml:space="preserve">Signals, tickets, and band breaches become draft briefs; the Product Lead pulls work into flight deliberately (WIP is human framing capacity)</w:t>
+              <w:t>Signals, tickets, and band breaches become draft briefs; the Product Lead pulls work into flight deliberately (WIP is personal framing capacity across pods and hats)</w:t>
             </w:r>
           </w:p>
         </w:tc>
@@ -1446,7 +1516,7 @@
           <w:sz w:val="22"/>
           <w:szCs w:val="22"/>
         </w:rPr>
-        <w:t xml:space="preserve">Flow stops for a human signature at exactly three points; everything between them moves at machine speed. Gate 1: what are we building, and why. Gate 2: what does provably done look like. Gate 3: does the evidence support release. Each signature is an authenticated approval binding an identity, a sequence position, and an artifact revision, and gates are enforced in tooling (hooks, branch protection, required checks) wherever agents act. Gates tier by risk domain, decided up front: default-open domains ship on green checks; default-closed domains (security, privacy, money, irreversible operations) block until a human signs. One invariant never tiers: the agents that build can never edit the exam.</w:t>
+        <w:t>Flow stops for a human signature at exactly three points; everything between them moves at machine speed. Gate 1: what are we building, and why. Gate 2: what does provably done look like. Gate 3: does the evidence support release. Each signature is an authenticated approval binding identity, active hat, sequence position, and artifact revision. Gates tier by risk domain and operating profile. Commercial default-closed work requires a passing fresh-context Critic, zero unresolved findings, and a separate-session Gate 3 second look. Regulated default-closed work requires two distinct humans. One invariant never tiers: the agents that build can never edit the exam.</w:t>
       </w:r>
     </w:p>
     <w:p>
@@ -1552,7 +1622,7 @@
           <w:sz w:val="18"/>
           <w:szCs w:val="18"/>
         </w:rPr>
-        <w:t xml:space="preserve">Human hours per item trend to the accountability floor while guardrails hold.</w:t>
+        <w:t>Greenfield products may use explicit leading indicators until production telemetry exists; these render as greenfield rather than falsely measurable. Human hours per item trend to the accountability floor while guardrails hold.</w:t>
       </w:r>
     </w:p>
     <w:p>
@@ -1787,6 +1857,7 @@
     </w:p>
     <w:sectPr>
       <w:footerReference w:type="default" r:id="rId7"/>
+      <w:headerReference w:type="default" r:id="rId12"/>
       <w:pgSz w:w="12240" w:h="15840" w:orient="portrait"/>
       <w:pgMar w:top="1240" w:right="1440" w:bottom="1240" w:left="1440" w:header="708" w:footer="708" w:gutter="0"/>
       <w:pgNumType/>
@@ -1901,6 +1972,16 @@
     </w:p>
   </w:footnote>
 </w:footnotes>
+</file>
+
+<file path=word/header1.xml><?xml version="1.0" encoding="utf-8"?>
+<w:hdr xmlns:m="http://schemas.openxmlformats.org/officeDocument/2006/math" xmlns:mc="http://schemas.openxmlformats.org/markup-compatibility/2006" xmlns:mo="http://schemas.microsoft.com/office/mac/office/2008/main" xmlns:mv="urn:schemas-microsoft-com:mac:vml" xmlns:o="urn:schemas-microsoft-com:office:office" xmlns:r="http://schemas.openxmlformats.org/officeDocument/2006/relationships" xmlns:v="urn:schemas-microsoft-com:vml" xmlns:w10="urn:schemas-microsoft-com:office:word" xmlns:w14="http://schemas.microsoft.com/office/word/2010/wordml" xmlns:w="http://schemas.openxmlformats.org/wordprocessingml/2006/main" xmlns:wne="http://schemas.microsoft.com/office/word/2006/wordml" xmlns:wp14="http://schemas.microsoft.com/office/word/2010/wordprocessingDrawing" xmlns:wp="http://schemas.openxmlformats.org/drawingml/2006/wordprocessingDrawing" xmlns:wpc="http://schemas.microsoft.com/office/word/2010/wordprocessingCanvas" xmlns:wpg="http://schemas.microsoft.com/office/word/2010/wordprocessingGroup" xmlns:wpi="http://schemas.microsoft.com/office/word/2010/wordprocessingInk" xmlns:wps="http://schemas.microsoft.com/office/word/2010/wordprocessingShape" mc:Ignorable="w14 wp14">
+  <w:p>
+    <w:pPr>
+      <w:pStyle w:val="Header"/>
+    </w:pPr>
+  </w:p>
+</w:hdr>
 </file>
 
 <file path=word/numbering.xml><?xml version="1.0" encoding="utf-8"?>

</xml_diff>

<commit_message>
Adopt agent-first domain assurance
</commit_message>
<xml_diff>
--- a/STEER-Framework.docx
+++ b/STEER-Framework.docx
@@ -79,7 +79,7 @@
           <w:sz w:val="20"/>
           <w:szCs w:val="20"/>
         </w:rPr>
-        <w:t xml:space="preserve">   ·   Framework v3.1   ·   September 2026</w:t>
+        <w:t xml:space="preserve">   ·   Framework v3.2   ·   September 2026</w:t>
       </w:r>
     </w:p>
     <w:p>
@@ -149,7 +149,7 @@
           <wp:inline distT="0" distB="0" distL="0" distR="0">
             <wp:extent cx="4848225" cy="1828800"/>
             <wp:effectExtent t="0" r="0" b="0" l="0"/>
-            <wp:docPr id="1" name="" descr="" title=""/>
+            <wp:docPr id="1" name="Figure 1" descr="Three STEER layers: framework, lifecycle, and platform, with different rates of change." title="Figure 1"/>
             <wp:cNvGraphicFramePr>
               <a:graphicFrameLocks xmlns:a="http://schemas.openxmlformats.org/drawingml/2006/main" noChangeAspect="1"/>
             </wp:cNvGraphicFramePr>
@@ -236,12 +236,7 @@
         <w:spacing w:after="160" w:line="274"/>
       </w:pPr>
       <w:r>
-        <w:rPr>
-          <w:color w:val="1a1a1a"/>
-          <w:sz w:val="22"/>
-          <w:szCs w:val="22"/>
-        </w:rPr>
-        <w:t>STEER projects a versioned organization → portfolio → product → pod topology, with an organization-level specialist pool. The operating repository declares governance and inheritance; each product names one home repository for item chains. Org Admins manage tenant identities, agents, keys, budgets, and defaults; Portfolio Leads sign mission briefs; Product Stewards exist when multiple pods share a product; the four pod accountabilities run the loop.</w:t>
+        <w:t>STEER projects a versioned organization → portfolio → product → pod topology, with an organization-level domain-assurance pool of independent agents and human exception owners. The operating repository declares governance and inheritance; each product names one home repository for item chains. Org Admins manage tenant identities, agents, keys, budgets, and defaults; Portfolio Leads sign mission briefs; Product Stewards exist when multiple pods share a product; the four pod accountabilities run the loop.</w:t>
       </w:r>
     </w:p>
     <w:p>
@@ -249,12 +244,7 @@
         <w:spacing w:after="160" w:line="274"/>
       </w:pPr>
       <w:r>
-        <w:rPr>
-          <w:color w:val="1a1a1a"/>
-          <w:sz w:val="22"/>
-          <w:szCs w:val="22"/>
-        </w:rPr>
-        <w:t>People and agents are identities assigned to explicit hats. One person may hold every hat. Capacity rolls up per human across pods and hats, while tenant boundaries isolate memory, keys, sandboxes, and evidence. Stack Packs make product stack choices operational, and readiness scans turn brownfield gaps into on-ramp briefs.</w:t>
+        <w:t>People and agents are identities assigned to explicit hats. One person may hold every core accountable hat; a human specialist hat appears only for a triggered exception and only when the person is qualified. Capacity rolls up per human across pods and hats, while tenant boundaries isolate memory, keys, sandboxes, and evidence. Stack Packs make product stack choices operational, and readiness scans turn brownfield gaps into on-ramp briefs.</w:t>
       </w:r>
     </w:p>
     <w:p>
@@ -357,7 +347,7 @@
           <wp:inline distT="0" distB="0" distL="0" distR="0">
             <wp:extent cx="5848350" cy="1638300"/>
             <wp:effectExtent t="0" r="0" b="0" l="0"/>
-            <wp:docPr id="1" name="" descr="" title=""/>
+            <wp:docPr id="1" name="Figure 2" descr="Eight-play STEER artifact chain from Sense through Learn, with human gates after intent, exam, and evaluation." title="Figure 2"/>
             <wp:cNvGraphicFramePr>
               <a:graphicFrameLocks xmlns:a="http://schemas.openxmlformats.org/drawingml/2006/main" noChangeAspect="1"/>
             </wp:cNvGraphicFramePr>
@@ -501,6 +491,9 @@
         <w:gridCol w:w="2560"/>
       </w:tblGrid>
       <w:tr>
+        <w:trPr>
+          <w:tblHeader w:val="true"/>
+        </w:trPr>
         <w:tc>
           <w:tcPr>
             <w:tcW w:type="dxa" w:w="1650"/>
@@ -893,18 +886,8 @@
             </w:tcMar>
           </w:tcPr>
           <w:p>
-            <w:pPr>
-              <w:spacing w:after="0" w:line="246"/>
-            </w:pPr>
-            <w:r>
-              <w:rPr>
-                <w:b w:val="false"/>
-                <w:bCs w:val="false"/>
-                <w:color w:val="1a1a1a"/>
-                <w:sz w:val="19"/>
-                <w:szCs w:val="19"/>
-              </w:rPr>
-              <w:t xml:space="preserve">Test agent drafts the exam; a fresh-context critic attacks it; timing tiers with risk; builders can never edit it</w:t>
+            <w:r>
+              <w:t>Test agent drafts the exam; independent domain agents review activated risks; a fresh-context critic attacks the whole; the Tech Lead receives one exception brief; builders can never edit it</w:t>
             </w:r>
           </w:p>
         </w:tc>
@@ -1511,12 +1494,17 @@
         <w:spacing w:after="160" w:line="274"/>
       </w:pPr>
       <w:r>
-        <w:rPr>
-          <w:color w:val="1a1a1a"/>
-          <w:sz w:val="22"/>
-          <w:szCs w:val="22"/>
-        </w:rPr>
-        <w:t>Flow stops for a human signature at exactly three points; everything between them moves at machine speed. Gate 1: what are we building, and why. Gate 2: what does provably done look like. Gate 3: does the evidence support release. Each signature is an authenticated approval binding identity, active hat, sequence position, and artifact revision. Gates tier by risk domain and operating profile. Commercial default-closed work requires a passing fresh-context Critic, zero unresolved findings, and a separate-session Gate 3 second look. Regulated default-closed work requires two distinct humans. One invariant never tiers: the agents that build can never edit the exam.</w:t>
+        <w:t>Flow stops for a human signature at exactly three points; everything between them moves at machine speed. Gate 1: what are we building, and why. Gate 2: what does provably done look like. Gate 3: does the evidence support release. Each signature is an authenticated approval binding identity, active hat, sequence position, and artifact revision.</w:t>
+      </w:r>
+    </w:p>
+    <w:p>
+      <w:r>
+        <w:t>Default-closed means independent assurance is mandatory, not that every domain creates a routine human queue. For each activated domain, a fresh-context domain agent that did not build the work produces a revision-bound review. Those reviews become one exception brief for the accountable gate owner. In commercial mode, a human specialist joins only for an unresolved blocker or major finding, missing or inconclusive evidence, a waiver, an explicit legal, contractual, or policy requirement, material rights or irreversible external effects, manual accessibility release validation, or production and spending authorization. Regulated default-closed work retains a human specialist for every activated domain and two distinct human signers. One invariant never tiers: the agents that build can never edit or approve the exam they implement.</w:t>
+      </w:r>
+    </w:p>
+    <w:p>
+      <w:r>
+        <w:t>Commercial default-closed work therefore requires current green domain-agent reviews, a passing fresh-context Critic with zero unresolved findings, one Tech Lead Gate 2 signature over the consolidated brief, and a separate-session Gate 3 second look. The system escalates exceptions visibly; it never silently converts a missing review into a pass.</w:t>
       </w:r>
     </w:p>
     <w:p>
@@ -1573,7 +1561,7 @@
           <wp:inline distT="0" distB="0" distL="0" distR="0">
             <wp:extent cx="4933950" cy="1943100"/>
             <wp:effectExtent t="0" r="0" b="0" l="0"/>
-            <wp:docPr id="1" name="" descr="" title=""/>
+            <wp:docPr id="1" name="Figure 3" descr="Chart showing human hours per shipped item falling as trust is earned while escaped defects remain below the guardrail." title="Figure 3"/>
             <wp:cNvGraphicFramePr>
               <a:graphicFrameLocks xmlns:a="http://schemas.openxmlformats.org/drawingml/2006/main" noChangeAspect="1"/>
             </wp:cNvGraphicFramePr>

</xml_diff>

<commit_message>
docs: incorporate approved D1 records and architecture decision
</commit_message>
<xml_diff>
--- a/STEER-Framework.docx
+++ b/STEER-Framework.docx
@@ -33,15 +33,17 @@
     </w:p>
     <w:p>
       <w:pPr>
+        <w:pStyle w:val="Title"/>
         <w:spacing w:after="120" w:before="160"/>
       </w:pPr>
       <w:r>
         <w:rPr>
           <w:b/>
           <w:bCs/>
-          <w:color w:val="1a1a1a"/>
+          <w:color w:val="000000"/>
           <w:sz w:val="52"/>
           <w:szCs w:val="52"/>
+          <w:u w:val="none"/>
         </w:rPr>
         <w:t xml:space="preserve">STEER Framework</w:t>
       </w:r>
@@ -438,7 +440,52 @@
           <w:sz w:val="22"/>
           <w:szCs w:val="22"/>
         </w:rPr>
-        <w:t xml:space="preserve">Every role home preserves the same attention order: the decision inbox for what needs judgment now, triggered candidates for what could enter next, and an ambient in-motion pane watched by aging bands. The platform projects these surfaces from the chain; it stores no private status. See STEER Practice Note 3, The Three Surfaces.</w:t>
+        <w:t>Every role home preserves the same attention order: the decision inbox for what needs judgment now, triggered candidates for what could enter next, and an ambient in-motion pane watched by aging bands. The platform projects these surfaces from the chain; it cannot invent private business status; D1 separately governs draft and execution records. See STEER Practice Note 3, The Three Surfaces.</w:t>
+      </w:r>
+    </w:p>
+    <w:p>
+      <w:pPr>
+        <w:pStyle w:val="Heading1"/>
+        <w:keepNext/>
+        <w:spacing w:before="280" w:after="140"/>
+      </w:pPr>
+      <w:r>
+        <w:rPr>
+          <w:b/>
+          <w:color w:val="000000"/>
+          <w:sz w:val="30"/>
+        </w:rPr>
+        <w:t>Private drafts and published artifacts</w:t>
+      </w:r>
+    </w:p>
+    <w:p>
+      <w:pPr>
+        <w:pStyle w:val="Normal"/>
+        <w:widowControl/>
+        <w:spacing w:after="140" w:line="259" w:lineRule="auto"/>
+      </w:pPr>
+      <w:r>
+        <w:rPr>
+          <w:rFonts w:ascii="Calibri" w:hAnsi="Calibri"/>
+          <w:color w:val="000000"/>
+          <w:sz w:val="21"/>
+        </w:rPr>
+        <w:t>Under the accepted D1 amendment, an organization with a verified storage binding may preserve encrypted private intent drafts and generation checkpoints in Postgres before publishing candidate documents. Preservation acknowledges an exact recoverable revision; publication commits only human-confirmed documents to Git. Neither action pulls work or supplies a gate signature. Git remains canonical business authority, while operational records and rebuildable projections have distinct recovery paths.</w:t>
+      </w:r>
+    </w:p>
+    <w:p>
+      <w:pPr>
+        <w:pStyle w:val="Normal"/>
+        <w:widowControl/>
+        <w:spacing w:after="140" w:line="259" w:lineRule="auto"/>
+      </w:pPr>
+      <w:r>
+        <w:rPr>
+          <w:rFonts w:ascii="Calibri" w:hAnsi="Calibri"/>
+          <w:color w:val="000000"/>
+          <w:sz w:val="21"/>
+        </w:rPr>
+        <w:t>Private drafts expire at the earliest of original creation plus seven days, verified publication plus 60 seconds, or discard plus 60 seconds; edits and reauthentication do not renew retention. Content-free operation and model-accounting records follow D1's one-year post-terminal/reconciliation rules, retaining unknown outcomes. Current owner/tenant/product grants, per-draft keys, expiry/hold controls and all-copy recovery verification remain prerequisites. The Operating Model gives the complete schedule and activation conditions. The accepted source is D1 revision 1 at commit 9442b2d212b2c47c436cbe527dd07707b3c8174c; the historical signed architecture and Exam remain unchanged.</w:t>
       </w:r>
     </w:p>
     <w:p>
@@ -2269,5 +2316,11 @@
       <w:szCs w:val="20"/>
     </w:rPr>
   </w:style>
+  <w:style w:type="paragraph" w:customStyle="1" w:styleId="Normal">
+    <w:name w:val="Normal"/>
+  </w:style>
+  <w:style w:type="paragraph" w:customStyle="1" w:styleId="Heading1">
+    <w:name w:val="heading 1"/>
+  </w:style>
 </w:styles>
 </file>
</xml_diff>